<commit_message>
Updated research report document
</commit_message>
<xml_diff>
--- a/AI_Impact_Employment_Research_Report.docx
+++ b/AI_Impact_Employment_Research_Report.docx
@@ -3886,34 +3886,34 @@
                 <w:sz w:val="20"/>
                 <w:szCs w:val="20"/>
               </w:rPr>
-              <w:t xml:space="default"/>
-            </w:r>
-          </w:p>
-        </w:tc>
-        <w:tc>
-          <w:tcPr>
-            <w:tcW w:type="dxa" w:w="4380"/>
-            <w:tcBorders>
-              <w:top w:val="single" w:color="CCCCCC" w:sz="1"/>
-              <w:left w:val="single" w:color="CCCCCC" w:sz="1"/>
-              <w:bottom w:val="single" w:color="CCCCCC" w:sz="1"/>
-              <w:right w:val="single" w:color="CCCCCC" w:sz="1"/>
-            </w:tcBorders>
-            <w:shd w:fill="F5F5F5" w:val="clear"/>
-            <w:tcMar>
-              <w:top w:type="dxa" w:w="80"/>
-              <w:left w:type="dxa" w:w="120"/>
-              <w:bottom w:type="dxa" w:w="80"/>
-              <w:right w:type="dxa" w:w="120"/>
-            </w:tcMar>
-          </w:tcPr>
-          <w:p>
-            <w:r>
-              <w:rPr>
-                <w:sz w:val="20"/>
-                <w:szCs w:val="20"/>
-              </w:rPr>
-              <w:t xml:space="default"/>
+              <w:t xml:space="preserve">Dredge Operators</w:t>
+            </w:r>
+          </w:p>
+        </w:tc>
+        <w:tc>
+          <w:tcPr>
+            <w:tcW w:type="dxa" w:w="4380"/>
+            <w:tcBorders>
+              <w:top w:val="single" w:color="CCCCCC" w:sz="1"/>
+              <w:left w:val="single" w:color="CCCCCC" w:sz="1"/>
+              <w:bottom w:val="single" w:color="CCCCCC" w:sz="1"/>
+              <w:right w:val="single" w:color="CCCCCC" w:sz="1"/>
+            </w:tcBorders>
+            <w:shd w:fill="F5F5F5" w:val="clear"/>
+            <w:tcMar>
+              <w:top w:type="dxa" w:w="80"/>
+              <w:left w:type="dxa" w:w="120"/>
+              <w:bottom w:type="dxa" w:w="80"/>
+              <w:right w:type="dxa" w:w="120"/>
+            </w:tcMar>
+          </w:tcPr>
+          <w:p>
+            <w:r>
+              <w:rPr>
+                <w:sz w:val="20"/>
+                <w:szCs w:val="20"/>
+              </w:rPr>
+              <w:t xml:space="preserve">Heavy machinery operation</w:t>
             </w:r>
           </w:p>
         </w:tc>
@@ -3969,33 +3969,34 @@
                 <w:sz w:val="20"/>
                 <w:szCs w:val="20"/>
               </w:rPr>
-              <w:t xml:space="preserve">/home/claude</w:t>
-            </w:r>
-          </w:p>
-        </w:tc>
-        <w:tc>
-          <w:tcPr>
-            <w:tcW w:type="dxa" w:w="4380"/>
-            <w:tcBorders>
-              <w:top w:val="single" w:color="CCCCCC" w:sz="1"/>
-              <w:left w:val="single" w:color="CCCCCC" w:sz="1"/>
-              <w:bottom w:val="single" w:color="CCCCCC" w:sz="1"/>
-              <w:right w:val="single" w:color="CCCCCC" w:sz="1"/>
-            </w:tcBorders>
-            <w:shd w:fill="F5F5F5" w:val="clear"/>
-            <w:tcMar>
-              <w:top w:type="dxa" w:w="80"/>
-              <w:left w:type="dxa" w:w="120"/>
-              <w:bottom w:type="dxa" w:w="80"/>
-              <w:right w:type="dxa" w:w="120"/>
-            </w:tcMar>
-          </w:tcPr>
-          <w:p>
-            <w:r>
-              <w:rPr>
-                <w:sz w:val="20"/>
-                <w:szCs w:val="20"/>
-              </w:rPr>
+              <w:t xml:space="preserve">Bridge and Lock Tenders</w:t>
+            </w:r>
+          </w:p>
+        </w:tc>
+        <w:tc>
+          <w:tcPr>
+            <w:tcW w:type="dxa" w:w="4380"/>
+            <w:tcBorders>
+              <w:top w:val="single" w:color="CCCCCC" w:sz="1"/>
+              <w:left w:val="single" w:color="CCCCCC" w:sz="1"/>
+              <w:bottom w:val="single" w:color="CCCCCC" w:sz="1"/>
+              <w:right w:val="single" w:color="CCCCCC" w:sz="1"/>
+            </w:tcBorders>
+            <w:shd w:fill="F5F5F5" w:val="clear"/>
+            <w:tcMar>
+              <w:top w:type="dxa" w:w="80"/>
+              <w:left w:type="dxa" w:w="120"/>
+              <w:bottom w:type="dxa" w:w="80"/>
+              <w:right w:type="dxa" w:w="120"/>
+            </w:tcMar>
+          </w:tcPr>
+          <w:p>
+            <w:r>
+              <w:rPr>
+                <w:sz w:val="20"/>
+                <w:szCs w:val="20"/>
+              </w:rPr>
+              <w:t xml:space="preserve">Physical infrastructure management</w:t>
             </w:r>
           </w:p>
         </w:tc>
@@ -4051,32 +4052,34 @@
                 <w:sz w:val="20"/>
                 <w:szCs w:val="20"/>
               </w:rPr>
-            </w:r>
-          </w:p>
-        </w:tc>
-        <w:tc>
-          <w:tcPr>
-            <w:tcW w:type="dxa" w:w="4380"/>
-            <w:tcBorders>
-              <w:top w:val="single" w:color="CCCCCC" w:sz="1"/>
-              <w:left w:val="single" w:color="CCCCCC" w:sz="1"/>
-              <w:bottom w:val="single" w:color="CCCCCC" w:sz="1"/>
-              <w:right w:val="single" w:color="CCCCCC" w:sz="1"/>
-            </w:tcBorders>
-            <w:shd w:fill="F5F5F5" w:val="clear"/>
-            <w:tcMar>
-              <w:top w:type="dxa" w:w="80"/>
-              <w:left w:type="dxa" w:w="120"/>
-              <w:bottom w:type="dxa" w:w="80"/>
-              <w:right w:type="dxa" w:w="120"/>
-            </w:tcMar>
-          </w:tcPr>
-          <w:p>
-            <w:r>
-              <w:rPr>
-                <w:sz w:val="20"/>
-                <w:szCs w:val="20"/>
-              </w:rPr>
+              <w:t xml:space="preserve">Water Treatment Plant and System Operators</w:t>
+            </w:r>
+          </w:p>
+        </w:tc>
+        <w:tc>
+          <w:tcPr>
+            <w:tcW w:type="dxa" w:w="4380"/>
+            <w:tcBorders>
+              <w:top w:val="single" w:color="CCCCCC" w:sz="1"/>
+              <w:left w:val="single" w:color="CCCCCC" w:sz="1"/>
+              <w:bottom w:val="single" w:color="CCCCCC" w:sz="1"/>
+              <w:right w:val="single" w:color="CCCCCC" w:sz="1"/>
+            </w:tcBorders>
+            <w:shd w:fill="F5F5F5" w:val="clear"/>
+            <w:tcMar>
+              <w:top w:type="dxa" w:w="80"/>
+              <w:left w:type="dxa" w:w="120"/>
+              <w:bottom w:type="dxa" w:w="80"/>
+              <w:right w:type="dxa" w:w="120"/>
+            </w:tcMar>
+          </w:tcPr>
+          <w:p>
+            <w:r>
+              <w:rPr>
+                <w:sz w:val="20"/>
+                <w:szCs w:val="20"/>
+              </w:rPr>
+              <w:t xml:space="preserve">Equipment monitoring &amp; safety</w:t>
             </w:r>
           </w:p>
         </w:tc>
@@ -4132,32 +4135,34 @@
                 <w:sz w:val="20"/>
                 <w:szCs w:val="20"/>
               </w:rPr>
-            </w:r>
-          </w:p>
-        </w:tc>
-        <w:tc>
-          <w:tcPr>
-            <w:tcW w:type="dxa" w:w="4380"/>
-            <w:tcBorders>
-              <w:top w:val="single" w:color="CCCCCC" w:sz="1"/>
-              <w:left w:val="single" w:color="CCCCCC" w:sz="1"/>
-              <w:bottom w:val="single" w:color="CCCCCC" w:sz="1"/>
-              <w:right w:val="single" w:color="CCCCCC" w:sz="1"/>
-            </w:tcBorders>
-            <w:shd w:fill="F5F5F5" w:val="clear"/>
-            <w:tcMar>
-              <w:top w:type="dxa" w:w="80"/>
-              <w:left w:type="dxa" w:w="120"/>
-              <w:bottom w:type="dxa" w:w="80"/>
-              <w:right w:type="dxa" w:w="120"/>
-            </w:tcMar>
-          </w:tcPr>
-          <w:p>
-            <w:r>
-              <w:rPr>
-                <w:sz w:val="20"/>
-                <w:szCs w:val="20"/>
-              </w:rPr>
+              <w:t xml:space="preserve">Foundry Mold and Coremakers</w:t>
+            </w:r>
+          </w:p>
+        </w:tc>
+        <w:tc>
+          <w:tcPr>
+            <w:tcW w:type="dxa" w:w="4380"/>
+            <w:tcBorders>
+              <w:top w:val="single" w:color="CCCCCC" w:sz="1"/>
+              <w:left w:val="single" w:color="CCCCCC" w:sz="1"/>
+              <w:bottom w:val="single" w:color="CCCCCC" w:sz="1"/>
+              <w:right w:val="single" w:color="CCCCCC" w:sz="1"/>
+            </w:tcBorders>
+            <w:shd w:fill="F5F5F5" w:val="clear"/>
+            <w:tcMar>
+              <w:top w:type="dxa" w:w="80"/>
+              <w:left w:type="dxa" w:w="120"/>
+              <w:bottom w:type="dxa" w:w="80"/>
+              <w:right w:type="dxa" w:w="120"/>
+            </w:tcMar>
+          </w:tcPr>
+          <w:p>
+            <w:r>
+              <w:rPr>
+                <w:sz w:val="20"/>
+                <w:szCs w:val="20"/>
+              </w:rPr>
+              <w:t xml:space="preserve">Physical manufacturing process</w:t>
             </w:r>
           </w:p>
         </w:tc>
@@ -4213,32 +4218,34 @@
                 <w:sz w:val="20"/>
                 <w:szCs w:val="20"/>
               </w:rPr>
-            </w:r>
-          </w:p>
-        </w:tc>
-        <w:tc>
-          <w:tcPr>
-            <w:tcW w:type="dxa" w:w="4380"/>
-            <w:tcBorders>
-              <w:top w:val="single" w:color="CCCCCC" w:sz="1"/>
-              <w:left w:val="single" w:color="CCCCCC" w:sz="1"/>
-              <w:bottom w:val="single" w:color="CCCCCC" w:sz="1"/>
-              <w:right w:val="single" w:color="CCCCCC" w:sz="1"/>
-            </w:tcBorders>
-            <w:shd w:fill="F5F5F5" w:val="clear"/>
-            <w:tcMar>
-              <w:top w:type="dxa" w:w="80"/>
-              <w:left w:type="dxa" w:w="120"/>
-              <w:bottom w:type="dxa" w:w="80"/>
-              <w:right w:type="dxa" w:w="120"/>
-            </w:tcMar>
-          </w:tcPr>
-          <w:p>
-            <w:r>
-              <w:rPr>
-                <w:sz w:val="20"/>
-                <w:szCs w:val="20"/>
-              </w:rPr>
+              <w:t xml:space="preserve">Rail-Track Laying and Maintenance Equipment Operators</w:t>
+            </w:r>
+          </w:p>
+        </w:tc>
+        <w:tc>
+          <w:tcPr>
+            <w:tcW w:type="dxa" w:w="4380"/>
+            <w:tcBorders>
+              <w:top w:val="single" w:color="CCCCCC" w:sz="1"/>
+              <w:left w:val="single" w:color="CCCCCC" w:sz="1"/>
+              <w:bottom w:val="single" w:color="CCCCCC" w:sz="1"/>
+              <w:right w:val="single" w:color="CCCCCC" w:sz="1"/>
+            </w:tcBorders>
+            <w:shd w:fill="F5F5F5" w:val="clear"/>
+            <w:tcMar>
+              <w:top w:type="dxa" w:w="80"/>
+              <w:left w:type="dxa" w:w="120"/>
+              <w:bottom w:type="dxa" w:w="80"/>
+              <w:right w:type="dxa" w:w="120"/>
+            </w:tcMar>
+          </w:tcPr>
+          <w:p>
+            <w:r>
+              <w:rPr>
+                <w:sz w:val="20"/>
+                <w:szCs w:val="20"/>
+              </w:rPr>
+              <w:t xml:space="preserve">Heavy equipment operation</w:t>
             </w:r>
           </w:p>
         </w:tc>
@@ -4294,32 +4301,34 @@
                 <w:sz w:val="20"/>
                 <w:szCs w:val="20"/>
               </w:rPr>
-            </w:r>
-          </w:p>
-        </w:tc>
-        <w:tc>
-          <w:tcPr>
-            <w:tcW w:type="dxa" w:w="4380"/>
-            <w:tcBorders>
-              <w:top w:val="single" w:color="CCCCCC" w:sz="1"/>
-              <w:left w:val="single" w:color="CCCCCC" w:sz="1"/>
-              <w:bottom w:val="single" w:color="CCCCCC" w:sz="1"/>
-              <w:right w:val="single" w:color="CCCCCC" w:sz="1"/>
-            </w:tcBorders>
-            <w:shd w:fill="F5F5F5" w:val="clear"/>
-            <w:tcMar>
-              <w:top w:type="dxa" w:w="80"/>
-              <w:left w:type="dxa" w:w="120"/>
-              <w:bottom w:type="dxa" w:w="80"/>
-              <w:right w:type="dxa" w:w="120"/>
-            </w:tcMar>
-          </w:tcPr>
-          <w:p>
-            <w:r>
-              <w:rPr>
-                <w:sz w:val="20"/>
-                <w:szCs w:val="20"/>
-              </w:rPr>
+              <w:t xml:space="preserve">Pile Driver Operators</w:t>
+            </w:r>
+          </w:p>
+        </w:tc>
+        <w:tc>
+          <w:tcPr>
+            <w:tcW w:type="dxa" w:w="4380"/>
+            <w:tcBorders>
+              <w:top w:val="single" w:color="CCCCCC" w:sz="1"/>
+              <w:left w:val="single" w:color="CCCCCC" w:sz="1"/>
+              <w:bottom w:val="single" w:color="CCCCCC" w:sz="1"/>
+              <w:right w:val="single" w:color="CCCCCC" w:sz="1"/>
+            </w:tcBorders>
+            <w:shd w:fill="F5F5F5" w:val="clear"/>
+            <w:tcMar>
+              <w:top w:type="dxa" w:w="80"/>
+              <w:left w:type="dxa" w:w="120"/>
+              <w:bottom w:type="dxa" w:w="80"/>
+              <w:right w:type="dxa" w:w="120"/>
+            </w:tcMar>
+          </w:tcPr>
+          <w:p>
+            <w:r>
+              <w:rPr>
+                <w:sz w:val="20"/>
+                <w:szCs w:val="20"/>
+              </w:rPr>
+              <w:t xml:space="preserve">Construction equipment operation</w:t>
             </w:r>
           </w:p>
         </w:tc>
@@ -4375,32 +4384,34 @@
                 <w:sz w:val="20"/>
                 <w:szCs w:val="20"/>
               </w:rPr>
-            </w:r>
-          </w:p>
-        </w:tc>
-        <w:tc>
-          <w:tcPr>
-            <w:tcW w:type="dxa" w:w="4380"/>
-            <w:tcBorders>
-              <w:top w:val="single" w:color="CCCCCC" w:sz="1"/>
-              <w:left w:val="single" w:color="CCCCCC" w:sz="1"/>
-              <w:bottom w:val="single" w:color="CCCCCC" w:sz="1"/>
-              <w:right w:val="single" w:color="CCCCCC" w:sz="1"/>
-            </w:tcBorders>
-            <w:shd w:fill="F5F5F5" w:val="clear"/>
-            <w:tcMar>
-              <w:top w:type="dxa" w:w="80"/>
-              <w:left w:type="dxa" w:w="120"/>
-              <w:bottom w:type="dxa" w:w="80"/>
-              <w:right w:type="dxa" w:w="120"/>
-            </w:tcMar>
-          </w:tcPr>
-          <w:p>
-            <w:r>
-              <w:rPr>
-                <w:sz w:val="20"/>
-                <w:szCs w:val="20"/>
-              </w:rPr>
+              <w:t xml:space="preserve">Floor Sanders and Finishers</w:t>
+            </w:r>
+          </w:p>
+        </w:tc>
+        <w:tc>
+          <w:tcPr>
+            <w:tcW w:type="dxa" w:w="4380"/>
+            <w:tcBorders>
+              <w:top w:val="single" w:color="CCCCCC" w:sz="1"/>
+              <w:left w:val="single" w:color="CCCCCC" w:sz="1"/>
+              <w:bottom w:val="single" w:color="CCCCCC" w:sz="1"/>
+              <w:right w:val="single" w:color="CCCCCC" w:sz="1"/>
+            </w:tcBorders>
+            <w:shd w:fill="F5F5F5" w:val="clear"/>
+            <w:tcMar>
+              <w:top w:type="dxa" w:w="80"/>
+              <w:left w:type="dxa" w:w="120"/>
+              <w:bottom w:type="dxa" w:w="80"/>
+              <w:right w:type="dxa" w:w="120"/>
+            </w:tcMar>
+          </w:tcPr>
+          <w:p>
+            <w:r>
+              <w:rPr>
+                <w:sz w:val="20"/>
+                <w:szCs w:val="20"/>
+              </w:rPr>
+              <w:t xml:space="preserve">Manual craft &amp; physical work</w:t>
             </w:r>
           </w:p>
         </w:tc>
@@ -4456,32 +4467,34 @@
                 <w:sz w:val="20"/>
                 <w:szCs w:val="20"/>
               </w:rPr>
-            </w:r>
-          </w:p>
-        </w:tc>
-        <w:tc>
-          <w:tcPr>
-            <w:tcW w:type="dxa" w:w="4380"/>
-            <w:tcBorders>
-              <w:top w:val="single" w:color="CCCCCC" w:sz="1"/>
-              <w:left w:val="single" w:color="CCCCCC" w:sz="1"/>
-              <w:bottom w:val="single" w:color="CCCCCC" w:sz="1"/>
-              <w:right w:val="single" w:color="CCCCCC" w:sz="1"/>
-            </w:tcBorders>
-            <w:shd w:fill="F5F5F5" w:val="clear"/>
-            <w:tcMar>
-              <w:top w:type="dxa" w:w="80"/>
-              <w:left w:type="dxa" w:w="120"/>
-              <w:bottom w:type="dxa" w:w="80"/>
-              <w:right w:type="dxa" w:w="120"/>
-            </w:tcMar>
-          </w:tcPr>
-          <w:p>
-            <w:r>
-              <w:rPr>
-                <w:sz w:val="20"/>
-                <w:szCs w:val="20"/>
-              </w:rPr>
+              <w:t xml:space="preserve">Orderlies</w:t>
+            </w:r>
+          </w:p>
+        </w:tc>
+        <w:tc>
+          <w:tcPr>
+            <w:tcW w:type="dxa" w:w="4380"/>
+            <w:tcBorders>
+              <w:top w:val="single" w:color="CCCCCC" w:sz="1"/>
+              <w:left w:val="single" w:color="CCCCCC" w:sz="1"/>
+              <w:bottom w:val="single" w:color="CCCCCC" w:sz="1"/>
+              <w:right w:val="single" w:color="CCCCCC" w:sz="1"/>
+            </w:tcBorders>
+            <w:shd w:fill="F5F5F5" w:val="clear"/>
+            <w:tcMar>
+              <w:top w:type="dxa" w:w="80"/>
+              <w:left w:type="dxa" w:w="120"/>
+              <w:bottom w:type="dxa" w:w="80"/>
+              <w:right w:type="dxa" w:w="120"/>
+            </w:tcMar>
+          </w:tcPr>
+          <w:p>
+            <w:r>
+              <w:rPr>
+                <w:sz w:val="20"/>
+                <w:szCs w:val="20"/>
+              </w:rPr>
+              <w:t xml:space="preserve">Direct patient care &amp; physical assistance</w:t>
             </w:r>
           </w:p>
         </w:tc>
@@ -4537,32 +4550,34 @@
                 <w:sz w:val="20"/>
                 <w:szCs w:val="20"/>
               </w:rPr>
-            </w:r>
-          </w:p>
-        </w:tc>
-        <w:tc>
-          <w:tcPr>
-            <w:tcW w:type="dxa" w:w="4380"/>
-            <w:tcBorders>
-              <w:top w:val="single" w:color="CCCCCC" w:sz="1"/>
-              <w:left w:val="single" w:color="CCCCCC" w:sz="1"/>
-              <w:bottom w:val="single" w:color="CCCCCC" w:sz="1"/>
-              <w:right w:val="single" w:color="CCCCCC" w:sz="1"/>
-            </w:tcBorders>
-            <w:shd w:fill="F5F5F5" w:val="clear"/>
-            <w:tcMar>
-              <w:top w:type="dxa" w:w="80"/>
-              <w:left w:type="dxa" w:w="120"/>
-              <w:bottom w:type="dxa" w:w="80"/>
-              <w:right w:type="dxa" w:w="120"/>
-            </w:tcMar>
-          </w:tcPr>
-          <w:p>
-            <w:r>
-              <w:rPr>
-                <w:sz w:val="20"/>
-                <w:szCs w:val="20"/>
-              </w:rPr>
+              <w:t xml:space="preserve">Motorboat Operators</w:t>
+            </w:r>
+          </w:p>
+        </w:tc>
+        <w:tc>
+          <w:tcPr>
+            <w:tcW w:type="dxa" w:w="4380"/>
+            <w:tcBorders>
+              <w:top w:val="single" w:color="CCCCCC" w:sz="1"/>
+              <w:left w:val="single" w:color="CCCCCC" w:sz="1"/>
+              <w:bottom w:val="single" w:color="CCCCCC" w:sz="1"/>
+              <w:right w:val="single" w:color="CCCCCC" w:sz="1"/>
+            </w:tcBorders>
+            <w:shd w:fill="F5F5F5" w:val="clear"/>
+            <w:tcMar>
+              <w:top w:type="dxa" w:w="80"/>
+              <w:left w:type="dxa" w:w="120"/>
+              <w:bottom w:type="dxa" w:w="80"/>
+              <w:right w:type="dxa" w:w="120"/>
+            </w:tcMar>
+          </w:tcPr>
+          <w:p>
+            <w:r>
+              <w:rPr>
+                <w:sz w:val="20"/>
+                <w:szCs w:val="20"/>
+              </w:rPr>
+              <w:t xml:space="preserve">Vehicle operation &amp; navigation</w:t>
             </w:r>
           </w:p>
         </w:tc>
@@ -4618,32 +4633,34 @@
                 <w:sz w:val="20"/>
                 <w:szCs w:val="20"/>
               </w:rPr>
-            </w:r>
-          </w:p>
-        </w:tc>
-        <w:tc>
-          <w:tcPr>
-            <w:tcW w:type="dxa" w:w="4380"/>
-            <w:tcBorders>
-              <w:top w:val="single" w:color="CCCCCC" w:sz="1"/>
-              <w:left w:val="single" w:color="CCCCCC" w:sz="1"/>
-              <w:bottom w:val="single" w:color="CCCCCC" w:sz="1"/>
-              <w:right w:val="single" w:color="CCCCCC" w:sz="1"/>
-            </w:tcBorders>
-            <w:shd w:fill="F5F5F5" w:val="clear"/>
-            <w:tcMar>
-              <w:top w:type="dxa" w:w="80"/>
-              <w:left w:type="dxa" w:w="120"/>
-              <w:bottom w:type="dxa" w:w="80"/>
-              <w:right w:type="dxa" w:w="120"/>
-            </w:tcMar>
-          </w:tcPr>
-          <w:p>
-            <w:r>
-              <w:rPr>
-                <w:sz w:val="20"/>
-                <w:szCs w:val="20"/>
-              </w:rPr>
+              <w:t xml:space="preserve">Logging Equipment Operators</w:t>
+            </w:r>
+          </w:p>
+        </w:tc>
+        <w:tc>
+          <w:tcPr>
+            <w:tcW w:type="dxa" w:w="4380"/>
+            <w:tcBorders>
+              <w:top w:val="single" w:color="CCCCCC" w:sz="1"/>
+              <w:left w:val="single" w:color="CCCCCC" w:sz="1"/>
+              <w:bottom w:val="single" w:color="CCCCCC" w:sz="1"/>
+              <w:right w:val="single" w:color="CCCCCC" w:sz="1"/>
+            </w:tcBorders>
+            <w:shd w:fill="F5F5F5" w:val="clear"/>
+            <w:tcMar>
+              <w:top w:type="dxa" w:w="80"/>
+              <w:left w:type="dxa" w:w="120"/>
+              <w:bottom w:type="dxa" w:w="80"/>
+              <w:right w:type="dxa" w:w="120"/>
+            </w:tcMar>
+          </w:tcPr>
+          <w:p>
+            <w:r>
+              <w:rPr>
+                <w:sz w:val="20"/>
+                <w:szCs w:val="20"/>
+              </w:rPr>
+              <w:t xml:space="preserve">Heavy machinery in challenging environments</w:t>
             </w:r>
           </w:p>
         </w:tc>

</xml_diff>